<commit_message>
Fix Section 4 ownership language: Build fee grants a license, not ownership
Rewrote to say plainly what was actually intended: Clementine retains
ownership of the code/design until the Buyout is completed; the Build
fee only grants the right to use the live hosted site. Previous 'and'/
'or' phrasing didn't say this correctly either way.

Co-Authored-By: Claude Sonnet 5 <noreply@anthropic.com>
</commit_message>
<xml_diff>
--- a/contracts/Website-Development-Care-Plan-Agreement.docx
+++ b/contracts/Website-Development-Care-Plan-Agreement.docx
@@ -209,14 +209,10 @@
         <w:spacing w:after="160"/>
       </w:pPr>
       <w:r>
-        <w:t xml:space="preserve">Until the Build fee (Section 2) </w:t>
+        <w:t>Clementine owns the design and source code of the site unless and until you complete the Buyout (Section 8). Paying the Build fee (Section 2) gives you the right to use the live, hosted site — not ownership of the underlying code or design — for as long as you're either current on the Care Plan (Section 5) or the site is in the frozen state described in Section 6. Completing the Buyout transfers full ownership of the source code and design to you.</w:t>
       </w:r>
-      <w:r>
-        <w:t>and</w:t>
-      </w:r>
-      <w:r>
-        <w:t xml:space="preserve"> the Buyout fee (Section 8) is paid in full, Clementine owns the design and source code of the site. Once the Build fee is paid, you have the right to use the live, hosted site for as long as you're either current on the Care Plan (Section 5) or have completed the Buyout (Section 8). Clementine keeps ownership of the underlying source code and design unless and until you complete the Buyout.</w:t>
-      </w:r>
+      <w:r/>
+      <w:r/>
     </w:p>
     <w:p>
       <w:pPr>

</xml_diff>

<commit_message>
Add Pro Care Plan track, de-anchor public Care Plan pricing, contract updates
- BUSINESS-PLAN.md: add Section 4b (Pro Care Plan / Contract B) for
  higher-value professional-service clients, backed by an SEO/design
  audit of a comparable local business and real market pricing data.
- site/index.html, site/terms.html: stop publishing a fixed Care Plan
  dollar amount so pricing can be personalized per client without
  conflicting with anything shown publicly.
- contracts/pro-care-plan-agreement.md: new draft agreement for the
  Pro Care Plan track.
- Add CLAUDE.md, Kalib Koons signed contract files, .gitignore updates
  for internal client/pipeline docs.
</commit_message>
<xml_diff>
--- a/contracts/Website-Development-Care-Plan-Agreement.docx
+++ b/contracts/Website-Development-Care-Plan-Agreement.docx
@@ -211,8 +211,11 @@
       <w:r>
         <w:t>Clementine owns the design and source code of the site unless and until you complete the Buyout (Section 8). Paying the Build fee (Section 2) gives you the right to use the live, hosted site — not ownership of the underlying code or design — for as long as you're either current on the Care Plan (Section 5) or the site is in the frozen state described in Section 6. Completing the Buyout transfers full ownership of the source code and design to you.</w:t>
       </w:r>
-      <w:r/>
-      <w:r/>
+    </w:p>
+    <w:p>
+      <w:pPr>
+        <w:spacing w:after="160"/>
+      </w:pPr>
     </w:p>
     <w:p>
       <w:pPr>
@@ -228,6 +231,7 @@
           <w:b/>
           <w:sz w:val="26"/>
         </w:rPr>
+        <w:lastRenderedPageBreak/>
         <w:t>5. Care Plan — $50/month, optional</w:t>
       </w:r>
     </w:p>
@@ -236,7 +240,6 @@
         <w:spacing w:after="160"/>
       </w:pPr>
       <w:r>
-        <w:lastRenderedPageBreak/>
         <w:t xml:space="preserve">You can choose to add ongoing </w:t>
       </w:r>
       <w:r>
@@ -502,6 +505,7 @@
           <w:b/>
           <w:sz w:val="26"/>
         </w:rPr>
+        <w:lastRenderedPageBreak/>
         <w:t>10. Liability</w:t>
       </w:r>
     </w:p>
@@ -510,7 +514,6 @@
         <w:spacing w:after="160"/>
       </w:pPr>
       <w:r>
-        <w:lastRenderedPageBreak/>
         <w:t>Our total liability under this Agreement is limited to the amount you've paid us in the 12 months before a claim. Neither party is liable to the other for indirect or consequential damages.</w:t>
       </w:r>
     </w:p>

</xml_diff>